<commit_message>
Purge UPTEA fee skim from Stewards downloads
</commit_message>
<xml_diff>
--- a/public/drafts/stewards-of-the-republic-latest.docx
+++ b/public/drafts/stewards-of-the-republic-latest.docx
@@ -8070,7 +8070,7 @@
         <w:pStyle w:val="FirstParagraph"/>
       </w:pPr>
       <w:r>
-        <w:t xml:space="preserve">What it does, in three rules. First: no court may shift the state’s costs or fees onto a beneficiary institution, a beneficiary representative, or a member organization that sued in good faith — win or lose — unless the case was frivolous or brought in bad faith. Second: a plaintiff whose action confers a substantial benefit on the trust may be awarded reasonable attorney fees, expert fees, and costs — paid first by the breaching fiduciary, or from a non-trust public source, or from the recovery itself only where the court finds that will not gut the remedy. Third: no bond may be demanded of a good-faith beneficiary as the price of getting into court or holding a transaction still while the case is heard.</w:t>
+        <w:t>What it does, in four rules. First: a plaintiff or intervenor that substantially prevails, or whose action is a substantial factor in conferring a substantial benefit on the trust, is awarded reasonable attorney fees, expert fees, forensic-accounting and appraisal fees, litigation expenses, and costs unless special circumstances would make an award unjust. Second: those fees are paid first by the breaching fiduciary or knowing participant where equity permits, and then by the responsible state, trustee agency, or public body from funds other than public trust property. They may never be paid from corpus, income, or any recovery belonging to the trust. Third: fees are measured at market rates and are additional to the trust's recovery, so nonprofit, public-interest, reduced-rate, or pro bono counsel can still sustain the work. Fourth: no bond may be demanded of a good-faith beneficiary as the price of getting into court or holding a transaction still while the case is heard, and the state's fees cannot be shifted onto that beneficiary unless the action was frivolous, bad-faith, or improper.</w:t>
       </w:r>
     </w:p>
     <w:p>
@@ -12194,10 +12194,10 @@
         <w:pStyle w:val="Heading2"/>
       </w:pPr>
       <w:bookmarkStart w:id="138" w:name="X70332adb60a32b206079fdf563d278ee83d8c90"/>
-      <w:r>
-        <w:t xml:space="preserve">Section 706. Fees, Costs, and No Cost-Shifting Against Good-Faith Beneficiaries.</w:t>
-      </w:r>
       <w:bookmarkEnd w:id="138"/>
+      <w:r>
+        <w:t>Section 706. Attorney Fees, Expert Fees, Costs, and Litigation Expenses.</w:t>
+      </w:r>
     </w:p>
     <w:p>
       <w:pPr>
@@ -12208,7 +12208,7 @@
         <w:pStyle w:val="PullQuote"/>
       </w:pPr>
       <w:r>
-        <w:t xml:space="preserve">The court may award reasonable attorney fees, expert fees, litigation expenses, and costs to a plaintiff or intervenor whose action confers a substantial benefit on the public educational trust.</w:t>
+        <w:t>(a) Award. In an action under this [Act], the court shall award reasonable attorney fees, expert fees, forensic-accounting and appraisal fees, litigation expenses, and costs to a plaintiff or intervenor that substantially prevails or whose action is a substantial factor in conferring a substantial benefit on a public educational trust, unless the court finds that special circumstances would make an award unjust.</w:t>
       </w:r>
     </w:p>
     <w:p>
@@ -12220,7 +12220,7 @@
         <w:pStyle w:val="PullQuote"/>
       </w:pPr>
       <w:r>
-        <w:t xml:space="preserve">Fees and costs may be paid:</w:t>
+        <w:t>(b) Substantial benefit; catalyst. An action is a substantial factor in conferring a substantial benefit whether the benefit is obtained by judgment, by a court-approved settlement or consent decree, or by voluntary accounting, restoration, corrective action, or policy change that the action was a substantial factor in producing, even without a final judgment on the merits.</w:t>
       </w:r>
     </w:p>
     <w:p>
@@ -12228,7 +12228,7 @@
         <w:pStyle w:val="PullQuote"/>
       </w:pPr>
       <w:r>
-        <w:t xml:space="preserve">  (1) by a breaching fiduciary or knowing participant, if equity and existing law permit;</w:t>
+        <w:t>(c) Source; trust protected. Fees, costs, and expenses awarded under this Section shall be paid, in the following order of preference, by:</w:t>
       </w:r>
     </w:p>
     <w:p>
@@ -12236,7 +12236,7 @@
         <w:pStyle w:val="PullQuote"/>
       </w:pPr>
       <w:r>
-        <w:t xml:space="preserve">  (2) from a recovery obtained for the trust, if the court finds that payment will not materially impair the remedial purpose of the recovery;</w:t>
+        <w:t>(1) a fiduciary, officer, employee, agent, or knowing participant who committed or knowingly participated in the breach, by surcharge or otherwise, to the extent equity and existing law permit; and</w:t>
       </w:r>
     </w:p>
     <w:p>
@@ -12244,7 +12244,7 @@
         <w:pStyle w:val="PullQuote"/>
       </w:pPr>
       <w:r>
-        <w:t xml:space="preserve">  (3) from a non-trust public source authorized by [state law]; or</w:t>
+        <w:t>(2) the responsible [State], state trustee, trustee agency, or public body, from funds other than public trust property, the immunity for which is waived under Section 702.</w:t>
       </w:r>
     </w:p>
     <w:p>
@@ -12252,7 +12252,7 @@
         <w:pStyle w:val="PullQuote"/>
       </w:pPr>
       <w:r>
-        <w:t xml:space="preserve">  (4) from a trust administration account only if permitted by the governing trust instrument, existing law, and court order.</w:t>
+        <w:t>Fees, costs, and expenses awarded under this Section shall not be paid from, charged against, deducted from, or satisfied out of trust corpus, trust income, or any recovery belonging to a public educational trust.</w:t>
       </w:r>
     </w:p>
     <w:p>
@@ -12264,9 +12264,21 @@
         <w:pStyle w:val="Compact"/>
       </w:pPr>
       <w:r>
-        <w:t xml:space="preserve">A beneficiary institution, beneficiary representative, future-beneficiary representative, or member organization bringing an action in good faith for relief to the trust may not be required to post a bond and may not be charged with the state trustee’s fees, costs, or expenses unless the court finds the action was frivolous, brought in bad faith, or brought for an improper purpose.</w:t>
-      </w:r>
-    </w:p>
+        <w:t>(d) Measure. Reasonable attorney fees under this Section equal the hours reasonably expended multiplied by the prevailing market hourly rate for comparable complex fiduciary or public-interest litigation in the relevant legal community; the court may adjust for the contingent risk of the action and for exceptional results. Fees are measured at prevailing market rates and may not be reduced because counsel is salaried, is employed by a nonprofit, public-interest, or governmental organization, or served at a reduced rate or without charge.</w:t>
+      </w:r>
+    </w:p>
+    <CT_P>
+      <w:pPr/>
+      <w:r>
+        <w:t>(e) Additional to recovery. An award under this Section is in addition to, and shall not reduce, any recovery restored to the trust under Section 705.</w:t>
+      </w:r>
+    </CT_P>
+    <CT_P>
+      <w:pPr/>
+      <w:r>
+        <w:t>(f) No charge against good-faith beneficiaries. A beneficiary institution, beneficiary representative, future-beneficiary representative, or member organization bringing or intervening in an action in good faith for relief to the trust may not be required to post a bond and may not be ordered to pay the fees, costs, or expenses of a state trustee or other defendant unless the court finds the action was frivolous, brought in bad faith, or brought for an improper purpose.</w:t>
+      </w:r>
+    </CT_P>
     <w:p>
       <w:pPr>
         <w:pStyle w:val="FirstParagraph"/>
@@ -12289,16 +12301,7 @@
         <w:pStyle w:val="BodyText"/>
       </w:pPr>
       <w:r>
-        <w:rPr>
-          <w:i/>
-        </w:rPr>
-        <w:t xml:space="preserve">Why it is drafted this way.</w:t>
-      </w:r>
-      <w:r>
-        <w:t xml:space="preserve"> </w:t>
-      </w:r>
-      <w:r>
-        <w:t xml:space="preserve">The structure is deliberately one-way, on the pattern of private-attorney-general statutes: a good-faith beneficiary plaintiff never posts a bond and never pays the state’s costs — the only exceptions are the ones no honest plaintiff fears: frivolousness, bad faith, improper purpose — while a plaintiff whose action confers a substantial benefit on the trust may recover its fees, expert costs, and expenses. The payment waterfall in subsection (b) is drafted to protect the trust even in victory: the breaching fiduciary pays first where equity permits; a non-trust public source is available; the recovery itself may pay only where the court finds the remedy will survive the deduction; and trust administration funds only where the trust instrument, existing law, and a court order all allow it. The no-bond rule in (c) matters most in injunction practice, where a required undertaking can price beneficiaries out of the provisional relief that stops a disposition before it closes — which is precisely when stopping it still helps.</w:t>
+        <w:t>Why it is drafted this way. The structure is deliberately one-way, on the pattern of private-attorney-general statutes: a good-faith beneficiary plaintiff never posts a bond and never pays the state's costs - the only exceptions are the ones no honest plaintiff fears: frivolousness, bad faith, improper purpose - while a plaintiff whose action substantially prevails or substantially benefits the trust recovers its fees, expert costs, and expenses. The revised payment rule separates recovery and fees permanently. The trust keeps every dollar restored to it; the fee award is paid first by the breaching fiduciary or knowing participant where equity permits, and then by the responsible state, trustee agency, or public body from funds other than trust property. The market-rate measure matters because the point is not just to reimburse a lawyer after the fact. It is to make enforcement fundable before the case begins, including by nonprofit, public-interest, reduced-rate, and pro bono counsel. The no-bond rule matters most in injunction practice, where a required undertaking can price beneficiaries out of the provisional relief that stops a disposition before it closes - which is precisely when stopping it still helps.</w:t>
       </w:r>
     </w:p>
     <w:p>
@@ -12306,16 +12309,7 @@
         <w:pStyle w:val="BodyText"/>
       </w:pPr>
       <w:r>
-        <w:rPr>
-          <w:i/>
-        </w:rPr>
-        <w:t xml:space="preserve">The dials.</w:t>
-      </w:r>
-      <w:r>
-        <w:t xml:space="preserve"> </w:t>
-      </w:r>
-      <w:r>
-        <w:t xml:space="preserve">Which payment sources an enacting state authorizes, and how the substantial-benefit standard interacts with the state’s existing fee doctrine.</w:t>
+        <w:t>The dials. How an enacting state implements the non-trust payment source, how the substantial-benefit and catalyst standards interact with existing fee doctrine, and how counsel calibrates surcharge, indemnification, and appropriation mechanics without charging corpus, income, or recoveries.</w:t>
       </w:r>
     </w:p>
     <w:p>

</xml_diff>